<commit_message>
docs(informes): Update del informe
Agrego el diagrama de navegacion.
</commit_message>
<xml_diff>
--- a/informes/Informe Sistema de Gestión Académica - UTN FRLP - Grupo 7.docx
+++ b/informes/Informe Sistema de Gestión Académica - UTN FRLP - Grupo 7.docx
@@ -9859,28 +9859,6 @@
     </w:p>
     <w:p>
       <w:pPr>
-        <w:pStyle w:val="Heading2"/>
-        <w:spacing w:after="300" w:before="0" w:line="240" w:lineRule="auto"/>
-        <w:rPr>
-          <w:color w:val="2b6cb0"/>
-          <w:sz w:val="24"/>
-          <w:szCs w:val="24"/>
-        </w:rPr>
-      </w:pPr>
-      <w:bookmarkStart w:colFirst="0" w:colLast="0" w:name="_pu7xif9fzvpu" w:id="1"/>
-      <w:bookmarkEnd w:id="1"/>
-      <w:r>
-        <w:rPr>
-          <w:color w:val="2b6cb0"/>
-          <w:sz w:val="24"/>
-          <w:szCs w:val="24"/>
-          <w:rtl w:val="0"/>
-        </w:rPr>
-        <w:t xml:space="preserve">6. Wireframe páginas principales</w:t>
-      </w:r>
-    </w:p>
-    <w:p>
-      <w:pPr>
         <w:pBdr>
           <w:top w:space="0" w:sz="0" w:val="nil"/>
           <w:left w:space="0" w:sz="0" w:val="nil"/>
@@ -9892,26 +9870,60 @@
         <w:spacing w:before="750" w:line="240" w:lineRule="auto"/>
         <w:rPr>
           <w:color w:val="718096"/>
-          <w:sz w:val="20"/>
-          <w:szCs w:val="20"/>
-        </w:rPr>
-      </w:pPr>
-      <w:r>
+          <w:sz w:val="18"/>
+          <w:szCs w:val="18"/>
+        </w:rPr>
+      </w:pPr>
+      <w:r>
+        <w:rPr>
+          <w:b w:val="1"/>
+          <w:bCs w:val="1"/>
+          <w:color w:val="2b6cb0"/>
+          <w:sz w:val="24"/>
+          <w:szCs w:val="24"/>
+          <w:rtl w:val="0"/>
+        </w:rPr>
+        <w:t xml:space="preserve">6. Mapa de sitio o diagrama de navegación (estructura de pantallas) </w:t>
+      </w:r>
+      <w:r>
+        <w:rPr>
+          <w:rtl w:val="0"/>
+        </w:rPr>
+      </w:r>
+    </w:p>
+    <w:p>
+      <w:pPr>
+        <w:pBdr>
+          <w:top w:space="0" w:sz="0" w:val="nil"/>
+          <w:left w:space="0" w:sz="0" w:val="nil"/>
+          <w:bottom w:space="0" w:sz="0" w:val="nil"/>
+          <w:right w:space="0" w:sz="0" w:val="nil"/>
+          <w:between w:space="0" w:sz="0" w:val="nil"/>
+        </w:pBdr>
+        <w:shd w:fill="auto" w:val="clear"/>
+        <w:spacing w:before="750" w:line="240" w:lineRule="auto"/>
         <w:rPr>
           <w:color w:val="718096"/>
-          <w:sz w:val="20"/>
-          <w:szCs w:val="20"/>
+          <w:sz w:val="18"/>
+          <w:szCs w:val="18"/>
+        </w:rPr>
+      </w:pPr>
+      <w:r>
+        <w:rPr>
+          <w:color w:val="718096"/>
+          <w:sz w:val="18"/>
+          <w:szCs w:val="18"/>
         </w:rPr>
         <w:drawing>
           <wp:inline distB="114300" distT="114300" distL="114300" distR="114300">
-            <wp:extent cx="7391400" cy="5257800"/>
+            <wp:extent cx="7391400" cy="3429000"/>
             <wp:effectExtent b="0" l="0" r="0" t="0"/>
-            <wp:docPr id="6" name="image3.png"/>
+            <wp:docPr id="2" name="image1.jpg"/>
             <a:graphic>
               <a:graphicData uri="http://schemas.openxmlformats.org/drawingml/2006/picture">
                 <pic:pic>
                   <pic:nvPicPr>
-                    <pic:cNvPr id="0" name="image3.png"/>
+                    <pic:cNvPr id="0" name="image1.jpg"/>
                     <pic:cNvPicPr preferRelativeResize="0"/>
                   </pic:nvPicPr>
                   <pic:blipFill>
@@ -9924,7 +9936,7 @@
                   <pic:spPr>
                     <a:xfrm>
                       <a:off x="0" y="0"/>
-                      <a:ext cx="7391400" cy="5257800"/>
+                      <a:ext cx="7391400" cy="3429000"/>
                     </a:xfrm>
                     <a:prstGeom prst="rect"/>
                     <a:ln/>
@@ -9937,6 +9949,159 @@
       </w:r>
       <w:r>
         <w:rPr>
+          <w:rtl w:val="0"/>
+        </w:rPr>
+      </w:r>
+    </w:p>
+    <w:p>
+      <w:pPr>
+        <w:pStyle w:val="Heading2"/>
+        <w:spacing w:after="300" w:before="0" w:line="240" w:lineRule="auto"/>
+        <w:rPr>
+          <w:color w:val="2b6cb0"/>
+          <w:sz w:val="24"/>
+          <w:szCs w:val="24"/>
+        </w:rPr>
+      </w:pPr>
+      <w:bookmarkStart w:colFirst="0" w:colLast="0" w:name="_rkoqf1t4lwso" w:id="1"/>
+      <w:bookmarkEnd w:id="1"/>
+      <w:r>
+        <w:rPr>
+          <w:rtl w:val="0"/>
+        </w:rPr>
+      </w:r>
+    </w:p>
+    <w:p>
+      <w:pPr>
+        <w:pStyle w:val="Heading2"/>
+        <w:spacing w:after="300" w:before="0" w:line="240" w:lineRule="auto"/>
+        <w:rPr>
+          <w:color w:val="2b6cb0"/>
+          <w:sz w:val="24"/>
+          <w:szCs w:val="24"/>
+        </w:rPr>
+      </w:pPr>
+      <w:bookmarkStart w:colFirst="0" w:colLast="0" w:name="_8oayoockiog2" w:id="2"/>
+      <w:bookmarkEnd w:id="2"/>
+      <w:r>
+        <w:rPr>
+          <w:rtl w:val="0"/>
+        </w:rPr>
+      </w:r>
+    </w:p>
+    <w:p>
+      <w:pPr>
+        <w:pStyle w:val="Heading2"/>
+        <w:spacing w:after="300" w:before="0" w:line="240" w:lineRule="auto"/>
+        <w:rPr>
+          <w:color w:val="2b6cb0"/>
+          <w:sz w:val="24"/>
+          <w:szCs w:val="24"/>
+        </w:rPr>
+      </w:pPr>
+      <w:bookmarkStart w:colFirst="0" w:colLast="0" w:name="_rardgfn8e7qb" w:id="3"/>
+      <w:bookmarkEnd w:id="3"/>
+      <w:r>
+        <w:rPr>
+          <w:rtl w:val="0"/>
+        </w:rPr>
+      </w:r>
+    </w:p>
+    <w:p>
+      <w:pPr>
+        <w:pStyle w:val="Heading2"/>
+        <w:spacing w:after="300" w:before="0" w:line="240" w:lineRule="auto"/>
+        <w:rPr>
+          <w:color w:val="2b6cb0"/>
+          <w:sz w:val="24"/>
+          <w:szCs w:val="24"/>
+        </w:rPr>
+      </w:pPr>
+      <w:bookmarkStart w:colFirst="0" w:colLast="0" w:name="_5ubik09m0q7l" w:id="4"/>
+      <w:bookmarkEnd w:id="4"/>
+      <w:r>
+        <w:rPr>
+          <w:rtl w:val="0"/>
+        </w:rPr>
+      </w:r>
+    </w:p>
+    <w:p>
+      <w:pPr>
+        <w:pStyle w:val="Heading2"/>
+        <w:spacing w:after="300" w:before="0" w:line="240" w:lineRule="auto"/>
+        <w:rPr>
+          <w:color w:val="2b6cb0"/>
+          <w:sz w:val="24"/>
+          <w:szCs w:val="24"/>
+        </w:rPr>
+      </w:pPr>
+      <w:bookmarkStart w:colFirst="0" w:colLast="0" w:name="_xxghpndrr9i9" w:id="5"/>
+      <w:bookmarkEnd w:id="5"/>
+      <w:r>
+        <w:rPr>
+          <w:rtl w:val="0"/>
+        </w:rPr>
+      </w:r>
+    </w:p>
+    <w:p>
+      <w:pPr>
+        <w:pStyle w:val="Heading2"/>
+        <w:spacing w:after="300" w:before="0" w:line="240" w:lineRule="auto"/>
+        <w:rPr>
+          <w:color w:val="2b6cb0"/>
+          <w:sz w:val="24"/>
+          <w:szCs w:val="24"/>
+        </w:rPr>
+      </w:pPr>
+      <w:bookmarkStart w:colFirst="0" w:colLast="0" w:name="_uzx7pegk6bb7" w:id="6"/>
+      <w:bookmarkEnd w:id="6"/>
+      <w:r>
+        <w:rPr>
+          <w:rtl w:val="0"/>
+        </w:rPr>
+      </w:r>
+    </w:p>
+    <w:p>
+      <w:pPr>
+        <w:pStyle w:val="Heading2"/>
+        <w:spacing w:after="300" w:before="0" w:line="240" w:lineRule="auto"/>
+        <w:rPr>
+          <w:color w:val="2b6cb0"/>
+          <w:sz w:val="24"/>
+          <w:szCs w:val="24"/>
+        </w:rPr>
+      </w:pPr>
+      <w:bookmarkStart w:colFirst="0" w:colLast="0" w:name="_pu7xif9fzvpu" w:id="7"/>
+      <w:bookmarkEnd w:id="7"/>
+      <w:r>
+        <w:rPr>
+          <w:color w:val="2b6cb0"/>
+          <w:sz w:val="24"/>
+          <w:szCs w:val="24"/>
+          <w:rtl w:val="0"/>
+        </w:rPr>
+        <w:t xml:space="preserve">7. Wireframe páginas principales</w:t>
+      </w:r>
+    </w:p>
+    <w:p>
+      <w:pPr>
+        <w:pBdr>
+          <w:top w:space="0" w:sz="0" w:val="nil"/>
+          <w:left w:space="0" w:sz="0" w:val="nil"/>
+          <w:bottom w:space="0" w:sz="0" w:val="nil"/>
+          <w:right w:space="0" w:sz="0" w:val="nil"/>
+          <w:between w:space="0" w:sz="0" w:val="nil"/>
+        </w:pBdr>
+        <w:shd w:fill="auto" w:val="clear"/>
+        <w:spacing w:before="750" w:line="240" w:lineRule="auto"/>
+        <w:rPr>
+          <w:color w:val="718096"/>
+          <w:sz w:val="20"/>
+          <w:szCs w:val="20"/>
+        </w:rPr>
+      </w:pPr>
+      <w:r>
+        <w:rPr>
           <w:color w:val="718096"/>
           <w:sz w:val="20"/>
           <w:szCs w:val="20"/>
@@ -9945,12 +10110,12 @@
           <wp:inline distB="114300" distT="114300" distL="114300" distR="114300">
             <wp:extent cx="7391400" cy="5257800"/>
             <wp:effectExtent b="0" l="0" r="0" t="0"/>
-            <wp:docPr id="4" name="image4.png"/>
+            <wp:docPr id="7" name="image6.png"/>
             <a:graphic>
               <a:graphicData uri="http://schemas.openxmlformats.org/drawingml/2006/picture">
                 <pic:pic>
                   <pic:nvPicPr>
-                    <pic:cNvPr id="0" name="image4.png"/>
+                    <pic:cNvPr id="0" name="image6.png"/>
                     <pic:cNvPicPr preferRelativeResize="0"/>
                   </pic:nvPicPr>
                   <pic:blipFill>
@@ -9984,7 +10149,7 @@
           <wp:inline distB="114300" distT="114300" distL="114300" distR="114300">
             <wp:extent cx="7391400" cy="5257800"/>
             <wp:effectExtent b="0" l="0" r="0" t="0"/>
-            <wp:docPr id="1" name="image5.png"/>
+            <wp:docPr id="5" name="image5.png"/>
             <a:graphic>
               <a:graphicData uri="http://schemas.openxmlformats.org/drawingml/2006/picture">
                 <pic:pic>
@@ -10023,12 +10188,12 @@
           <wp:inline distB="114300" distT="114300" distL="114300" distR="114300">
             <wp:extent cx="7391400" cy="5257800"/>
             <wp:effectExtent b="0" l="0" r="0" t="0"/>
-            <wp:docPr id="2" name="image6.png"/>
+            <wp:docPr id="1" name="image3.png"/>
             <a:graphic>
               <a:graphicData uri="http://schemas.openxmlformats.org/drawingml/2006/picture">
                 <pic:pic>
                   <pic:nvPicPr>
-                    <pic:cNvPr id="0" name="image6.png"/>
+                    <pic:cNvPr id="0" name="image3.png"/>
                     <pic:cNvPicPr preferRelativeResize="0"/>
                   </pic:nvPicPr>
                   <pic:blipFill>
@@ -10054,6 +10219,45 @@
       </w:r>
       <w:r>
         <w:rPr>
+          <w:color w:val="718096"/>
+          <w:sz w:val="20"/>
+          <w:szCs w:val="20"/>
+        </w:rPr>
+        <w:drawing>
+          <wp:inline distB="114300" distT="114300" distL="114300" distR="114300">
+            <wp:extent cx="7391400" cy="5257800"/>
+            <wp:effectExtent b="0" l="0" r="0" t="0"/>
+            <wp:docPr id="3" name="image4.png"/>
+            <a:graphic>
+              <a:graphicData uri="http://schemas.openxmlformats.org/drawingml/2006/picture">
+                <pic:pic>
+                  <pic:nvPicPr>
+                    <pic:cNvPr id="0" name="image4.png"/>
+                    <pic:cNvPicPr preferRelativeResize="0"/>
+                  </pic:nvPicPr>
+                  <pic:blipFill>
+                    <a:blip r:embed="rId10"/>
+                    <a:srcRect b="0" l="0" r="0" t="0"/>
+                    <a:stretch>
+                      <a:fillRect/>
+                    </a:stretch>
+                  </pic:blipFill>
+                  <pic:spPr>
+                    <a:xfrm>
+                      <a:off x="0" y="0"/>
+                      <a:ext cx="7391400" cy="5257800"/>
+                    </a:xfrm>
+                    <a:prstGeom prst="rect"/>
+                    <a:ln/>
+                  </pic:spPr>
+                </pic:pic>
+              </a:graphicData>
+            </a:graphic>
+          </wp:inline>
+        </w:drawing>
+      </w:r>
+      <w:r>
+        <w:rPr>
           <w:rtl w:val="0"/>
         </w:rPr>
       </w:r>
@@ -10068,8 +10272,8 @@
           <w:szCs w:val="24"/>
         </w:rPr>
       </w:pPr>
-      <w:bookmarkStart w:colFirst="0" w:colLast="0" w:name="_4ocv7l7o8v83" w:id="2"/>
-      <w:bookmarkEnd w:id="2"/>
+      <w:bookmarkStart w:colFirst="0" w:colLast="0" w:name="_4ocv7l7o8v83" w:id="8"/>
+      <w:bookmarkEnd w:id="8"/>
       <w:r>
         <w:rPr>
           <w:rtl w:val="0"/>
@@ -10086,8 +10290,8 @@
           <w:szCs w:val="24"/>
         </w:rPr>
       </w:pPr>
-      <w:bookmarkStart w:colFirst="0" w:colLast="0" w:name="_hf0sjvgikfv" w:id="3"/>
-      <w:bookmarkEnd w:id="3"/>
+      <w:bookmarkStart w:colFirst="0" w:colLast="0" w:name="_hf0sjvgikfv" w:id="9"/>
+      <w:bookmarkEnd w:id="9"/>
       <w:r>
         <w:rPr>
           <w:color w:val="2b6cb0"/>
@@ -10095,7 +10299,7 @@
           <w:szCs w:val="24"/>
           <w:rtl w:val="0"/>
         </w:rPr>
-        <w:t xml:space="preserve">7. Decisiones graficas</w:t>
+        <w:t xml:space="preserve">8. Decisiones gráficas</w:t>
       </w:r>
     </w:p>
     <w:p>
@@ -10122,10 +10326,10 @@
       </w:r>
     </w:p>
     <w:sectPr>
-      <w:headerReference r:id="rId10" w:type="default"/>
-      <w:headerReference r:id="rId11" w:type="first"/>
-      <w:footerReference r:id="rId12" w:type="default"/>
-      <w:footerReference r:id="rId13" w:type="first"/>
+      <w:headerReference r:id="rId11" w:type="default"/>
+      <w:headerReference r:id="rId12" w:type="first"/>
+      <w:footerReference r:id="rId13" w:type="default"/>
+      <w:footerReference r:id="rId14" w:type="first"/>
       <w:pgSz w:h="15840" w:w="12240" w:orient="portrait"/>
       <w:pgMar w:bottom="300" w:top="300" w:left="300" w:right="300" w:header="0" w:footer="720"/>
       <w:pgNumType w:start="1"/>
@@ -10174,7 +10378,7 @@
         <w:szCs w:val="18"/>
         <w:rtl w:val="0"/>
       </w:rPr>
-      <w:t xml:space="preserve">-11</w:t>
+      <w:t xml:space="preserve">-12</w:t>
     </w:r>
     <w:r>
       <w:rPr>
@@ -10220,12 +10424,12 @@
         <wp:inline distB="114300" distT="114300" distL="114300" distR="114300">
           <wp:extent cx="690153" cy="1090613"/>
           <wp:effectExtent b="0" l="0" r="0" t="0"/>
-          <wp:docPr id="5" name="image2.png"/>
+          <wp:docPr id="6" name="image7.png"/>
           <a:graphic>
             <a:graphicData uri="http://schemas.openxmlformats.org/drawingml/2006/picture">
               <pic:pic>
                 <pic:nvPicPr>
-                  <pic:cNvPr id="0" name="image2.png"/>
+                  <pic:cNvPr id="0" name="image7.png"/>
                   <pic:cNvPicPr preferRelativeResize="0"/>
                 </pic:nvPicPr>
                 <pic:blipFill>
@@ -10360,12 +10564,12 @@
           <wp:extent cx="5860971" cy="776288"/>
           <wp:effectExtent b="0" l="0" r="0" t="0"/>
           <wp:wrapSquare wrapText="bothSides" distB="114300" distT="114300" distL="114300" distR="114300"/>
-          <wp:docPr id="3" name="image1.png"/>
+          <wp:docPr id="4" name="image2.png"/>
           <a:graphic>
             <a:graphicData uri="http://schemas.openxmlformats.org/drawingml/2006/picture">
               <pic:pic>
                 <pic:nvPicPr>
-                  <pic:cNvPr id="0" name="image1.png"/>
+                  <pic:cNvPr id="0" name="image2.png"/>
                   <pic:cNvPicPr preferRelativeResize="0"/>
                 </pic:nvPicPr>
                 <pic:blipFill>

</xml_diff>